<commit_message>
Add TFC Word with La Otra FP/PRO2 header on every page
</commit_message>
<xml_diff>
--- a/tfc/TFC_SolveIT.docx
+++ b/tfc/TFC_SolveIT.docx
@@ -4,6 +4,46 @@
   <w:body>
     <w:p/>
     <w:p/>
+    <w:p/>
+    <w:p>
+      <w:pPr>
+        <w:jc w:val="center"/>
+      </w:pPr>
+      <w:r>
+        <w:drawing>
+          <wp:inline xmlns:a="http://schemas.openxmlformats.org/drawingml/2006/main" xmlns:pic="http://schemas.openxmlformats.org/drawingml/2006/picture">
+            <wp:extent cx="2880000" cy="1440000"/>
+            <wp:docPr id="1" name="Picture 1"/>
+            <wp:cNvGraphicFramePr>
+              <a:graphicFrameLocks noChangeAspect="1"/>
+            </wp:cNvGraphicFramePr>
+            <a:graphic>
+              <a:graphicData uri="http://schemas.openxmlformats.org/drawingml/2006/picture">
+                <pic:pic>
+                  <pic:nvPicPr>
+                    <pic:cNvPr id="0" name="logo_portada.png"/>
+                    <pic:cNvPicPr/>
+                  </pic:nvPicPr>
+                  <pic:blipFill>
+                    <a:blip r:embed="rId11"/>
+                    <a:stretch>
+                      <a:fillRect/>
+                    </a:stretch>
+                  </pic:blipFill>
+                  <pic:spPr>
+                    <a:xfrm>
+                      <a:off x="0" y="0"/>
+                      <a:ext cx="2880000" cy="1440000"/>
+                    </a:xfrm>
+                    <a:prstGeom prst="rect"/>
+                  </pic:spPr>
+                </pic:pic>
+              </a:graphicData>
+            </a:graphic>
+          </wp:inline>
+        </w:drawing>
+      </w:r>
+    </w:p>
     <w:p/>
     <w:p>
       <w:pPr>
@@ -33,7 +73,6 @@
     </w:p>
     <w:p/>
     <w:p/>
-    <w:p/>
     <w:p>
       <w:pPr>
         <w:jc w:val="center"/>
@@ -42,12 +81,11 @@
         <w:rPr>
           <w:rFonts w:ascii="Times New Roman" w:hAnsi="Times New Roman"/>
           <w:b/>
-          <w:sz w:val="32"/>
+          <w:sz w:val="30"/>
         </w:rPr>
         <w:t>SolveIT: Plataforma SaaS multi-tenant para la gestión inteligente de incidencias IT en pequeñas y medianas empresas</w:t>
       </w:r>
     </w:p>
-    <w:p/>
     <w:p/>
     <w:p/>
     <w:p/>
@@ -104,7 +142,6 @@
         <w:t>[NOMBRE Y APELLIDOS DEL TUTOR]</w:t>
       </w:r>
     </w:p>
-    <w:p/>
     <w:p/>
     <w:p/>
     <w:p/>
@@ -127,8 +164,13 @@
       </w:r>
     </w:p>
     <w:p>
-      <w:pPr>
-        <w:jc w:val="center"/>
+      <w:r>
+        <w:br w:type="page"/>
+      </w:r>
+    </w:p>
+    <w:p>
+      <w:pPr>
+        <w:jc w:val="left"/>
       </w:pPr>
       <w:r>
         <w:rPr>
@@ -173,7 +215,7 @@
     <w:p/>
     <w:p>
       <w:pPr>
-        <w:jc w:val="center"/>
+        <w:jc w:val="left"/>
       </w:pPr>
       <w:r>
         <w:rPr>
@@ -230,31 +272,76 @@
         <w:rPr>
           <w:rFonts w:ascii="Times New Roman" w:hAnsi="Times New Roman"/>
           <w:b/>
-          <w:sz w:val="32"/>
+          <w:sz w:val="40"/>
         </w:rPr>
         <w:t>ÍNDICE</w:t>
       </w:r>
     </w:p>
     <w:p/>
     <w:p>
+      <w:pPr>
+        <w:tabs>
+          <w:tab w:pos="8787" w:val="right" w:leader="hyphen"/>
+        </w:tabs>
+      </w:pPr>
       <w:r>
         <w:rPr>
           <w:rFonts w:ascii="Times New Roman" w:hAnsi="Times New Roman"/>
+          <w:b/>
           <w:sz w:val="24"/>
         </w:rPr>
         <w:t>1. INTRODUCCIÓN</w:t>
       </w:r>
-    </w:p>
-    <w:p>
+      <w:r>
+        <w:rPr>
+          <w:sz w:val="24"/>
+        </w:rPr>
+        <w:tab/>
+      </w:r>
       <w:r>
         <w:rPr>
           <w:rFonts w:ascii="Times New Roman" w:hAnsi="Times New Roman"/>
+          <w:b/>
+          <w:sz w:val="24"/>
+        </w:rPr>
+        <w:t>5</w:t>
+      </w:r>
+    </w:p>
+    <w:p>
+      <w:pPr>
+        <w:tabs>
+          <w:tab w:pos="8787" w:val="right" w:leader="hyphen"/>
+        </w:tabs>
+      </w:pPr>
+      <w:r>
+        <w:rPr>
+          <w:rFonts w:ascii="Times New Roman" w:hAnsi="Times New Roman"/>
+          <w:b/>
           <w:sz w:val="24"/>
         </w:rPr>
         <w:t>2. ANÁLISIS</w:t>
       </w:r>
+      <w:r>
+        <w:rPr>
+          <w:sz w:val="24"/>
+        </w:rPr>
+        <w:tab/>
+      </w:r>
+      <w:r>
+        <w:rPr>
+          <w:rFonts w:ascii="Times New Roman" w:hAnsi="Times New Roman"/>
+          <w:b/>
+          <w:sz w:val="24"/>
+        </w:rPr>
+        <w:t>6</w:t>
+      </w:r>
     </w:p>
     <w:p>
+      <w:pPr>
+        <w:tabs>
+          <w:tab w:pos="8787" w:val="right" w:leader="hyphen"/>
+        </w:tabs>
+      </w:pPr>
       <w:r>
         <w:rPr>
           <w:rFonts w:ascii="Times New Roman" w:hAnsi="Times New Roman"/>
@@ -262,8 +349,26 @@
         </w:rPr>
         <w:t xml:space="preserve">    2.1 Estudio de mercado</w:t>
       </w:r>
+      <w:r>
+        <w:rPr>
+          <w:sz w:val="24"/>
+        </w:rPr>
+        <w:tab/>
+      </w:r>
+      <w:r>
+        <w:rPr>
+          <w:rFonts w:ascii="Times New Roman" w:hAnsi="Times New Roman"/>
+          <w:sz w:val="24"/>
+        </w:rPr>
+        <w:t>6</w:t>
+      </w:r>
     </w:p>
     <w:p>
+      <w:pPr>
+        <w:tabs>
+          <w:tab w:pos="8787" w:val="right" w:leader="hyphen"/>
+        </w:tabs>
+      </w:pPr>
       <w:r>
         <w:rPr>
           <w:rFonts w:ascii="Times New Roman" w:hAnsi="Times New Roman"/>
@@ -271,17 +376,55 @@
         </w:rPr>
         <w:t xml:space="preserve">    2.2 Elección de soluciones</w:t>
       </w:r>
-    </w:p>
-    <w:p>
+      <w:r>
+        <w:rPr>
+          <w:sz w:val="24"/>
+        </w:rPr>
+        <w:tab/>
+      </w:r>
       <w:r>
         <w:rPr>
           <w:rFonts w:ascii="Times New Roman" w:hAnsi="Times New Roman"/>
           <w:sz w:val="24"/>
         </w:rPr>
-        <w:t>3. VALORACIÓN ECONÓMICA</w:t>
+        <w:t>8</w:t>
       </w:r>
     </w:p>
     <w:p>
+      <w:pPr>
+        <w:tabs>
+          <w:tab w:pos="8787" w:val="right" w:leader="hyphen"/>
+        </w:tabs>
+      </w:pPr>
+      <w:r>
+        <w:rPr>
+          <w:rFonts w:ascii="Times New Roman" w:hAnsi="Times New Roman"/>
+          <w:b/>
+          <w:sz w:val="24"/>
+        </w:rPr>
+        <w:t>3. VALORACIÓN ECONÓMICA</w:t>
+      </w:r>
+      <w:r>
+        <w:rPr>
+          <w:sz w:val="24"/>
+        </w:rPr>
+        <w:tab/>
+      </w:r>
+      <w:r>
+        <w:rPr>
+          <w:rFonts w:ascii="Times New Roman" w:hAnsi="Times New Roman"/>
+          <w:b/>
+          <w:sz w:val="24"/>
+        </w:rPr>
+        <w:t>10</w:t>
+      </w:r>
+    </w:p>
+    <w:p>
+      <w:pPr>
+        <w:tabs>
+          <w:tab w:pos="8787" w:val="right" w:leader="hyphen"/>
+        </w:tabs>
+      </w:pPr>
       <w:r>
         <w:rPr>
           <w:rFonts w:ascii="Times New Roman" w:hAnsi="Times New Roman"/>
@@ -289,8 +432,26 @@
         </w:rPr>
         <w:t xml:space="preserve">    3.1 Hardware</w:t>
       </w:r>
+      <w:r>
+        <w:rPr>
+          <w:sz w:val="24"/>
+        </w:rPr>
+        <w:tab/>
+      </w:r>
+      <w:r>
+        <w:rPr>
+          <w:rFonts w:ascii="Times New Roman" w:hAnsi="Times New Roman"/>
+          <w:sz w:val="24"/>
+        </w:rPr>
+        <w:t>10</w:t>
+      </w:r>
     </w:p>
     <w:p>
+      <w:pPr>
+        <w:tabs>
+          <w:tab w:pos="8787" w:val="right" w:leader="hyphen"/>
+        </w:tabs>
+      </w:pPr>
       <w:r>
         <w:rPr>
           <w:rFonts w:ascii="Times New Roman" w:hAnsi="Times New Roman"/>
@@ -298,8 +459,26 @@
         </w:rPr>
         <w:t xml:space="preserve">    3.2 Licencias y servicios</w:t>
       </w:r>
+      <w:r>
+        <w:rPr>
+          <w:sz w:val="24"/>
+        </w:rPr>
+        <w:tab/>
+      </w:r>
+      <w:r>
+        <w:rPr>
+          <w:rFonts w:ascii="Times New Roman" w:hAnsi="Times New Roman"/>
+          <w:sz w:val="24"/>
+        </w:rPr>
+        <w:t>11</w:t>
+      </w:r>
     </w:p>
     <w:p>
+      <w:pPr>
+        <w:tabs>
+          <w:tab w:pos="8787" w:val="right" w:leader="hyphen"/>
+        </w:tabs>
+      </w:pPr>
       <w:r>
         <w:rPr>
           <w:rFonts w:ascii="Times New Roman" w:hAnsi="Times New Roman"/>
@@ -307,8 +486,26 @@
         </w:rPr>
         <w:t xml:space="preserve">    3.3 Personal</w:t>
       </w:r>
+      <w:r>
+        <w:rPr>
+          <w:sz w:val="24"/>
+        </w:rPr>
+        <w:tab/>
+      </w:r>
+      <w:r>
+        <w:rPr>
+          <w:rFonts w:ascii="Times New Roman" w:hAnsi="Times New Roman"/>
+          <w:sz w:val="24"/>
+        </w:rPr>
+        <w:t>11</w:t>
+      </w:r>
     </w:p>
     <w:p>
+      <w:pPr>
+        <w:tabs>
+          <w:tab w:pos="8787" w:val="right" w:leader="hyphen"/>
+        </w:tabs>
+      </w:pPr>
       <w:r>
         <w:rPr>
           <w:rFonts w:ascii="Times New Roman" w:hAnsi="Times New Roman"/>
@@ -316,26 +513,84 @@
         </w:rPr>
         <w:t xml:space="preserve">    3.4 Costes de mantenimiento</w:t>
       </w:r>
-    </w:p>
-    <w:p>
+      <w:r>
+        <w:rPr>
+          <w:sz w:val="24"/>
+        </w:rPr>
+        <w:tab/>
+      </w:r>
       <w:r>
         <w:rPr>
           <w:rFonts w:ascii="Times New Roman" w:hAnsi="Times New Roman"/>
           <w:sz w:val="24"/>
         </w:rPr>
-        <w:t>4. VIABILIDAD DEL PROYECTO</w:t>
+        <w:t>12</w:t>
       </w:r>
     </w:p>
     <w:p>
+      <w:pPr>
+        <w:tabs>
+          <w:tab w:pos="8787" w:val="right" w:leader="hyphen"/>
+        </w:tabs>
+      </w:pPr>
       <w:r>
         <w:rPr>
           <w:rFonts w:ascii="Times New Roman" w:hAnsi="Times New Roman"/>
+          <w:b/>
+          <w:sz w:val="24"/>
+        </w:rPr>
+        <w:t>4. VIABILIDAD DEL PROYECTO</w:t>
+      </w:r>
+      <w:r>
+        <w:rPr>
+          <w:sz w:val="24"/>
+        </w:rPr>
+        <w:tab/>
+      </w:r>
+      <w:r>
+        <w:rPr>
+          <w:rFonts w:ascii="Times New Roman" w:hAnsi="Times New Roman"/>
+          <w:b/>
+          <w:sz w:val="24"/>
+        </w:rPr>
+        <w:t>13</w:t>
+      </w:r>
+    </w:p>
+    <w:p>
+      <w:pPr>
+        <w:tabs>
+          <w:tab w:pos="8787" w:val="right" w:leader="hyphen"/>
+        </w:tabs>
+      </w:pPr>
+      <w:r>
+        <w:rPr>
+          <w:rFonts w:ascii="Times New Roman" w:hAnsi="Times New Roman"/>
+          <w:b/>
           <w:sz w:val="24"/>
         </w:rPr>
         <w:t>5. PUESTA EN MARCHA</w:t>
       </w:r>
+      <w:r>
+        <w:rPr>
+          <w:sz w:val="24"/>
+        </w:rPr>
+        <w:tab/>
+      </w:r>
+      <w:r>
+        <w:rPr>
+          <w:rFonts w:ascii="Times New Roman" w:hAnsi="Times New Roman"/>
+          <w:b/>
+          <w:sz w:val="24"/>
+        </w:rPr>
+        <w:t>16</w:t>
+      </w:r>
     </w:p>
     <w:p>
+      <w:pPr>
+        <w:tabs>
+          <w:tab w:pos="8787" w:val="right" w:leader="hyphen"/>
+        </w:tabs>
+      </w:pPr>
       <w:r>
         <w:rPr>
           <w:rFonts w:ascii="Times New Roman" w:hAnsi="Times New Roman"/>
@@ -343,8 +598,26 @@
         </w:rPr>
         <w:t xml:space="preserve">    5.1 Forma jurídica y trámites</w:t>
       </w:r>
+      <w:r>
+        <w:rPr>
+          <w:sz w:val="24"/>
+        </w:rPr>
+        <w:tab/>
+      </w:r>
+      <w:r>
+        <w:rPr>
+          <w:rFonts w:ascii="Times New Roman" w:hAnsi="Times New Roman"/>
+          <w:sz w:val="24"/>
+        </w:rPr>
+        <w:t>16</w:t>
+      </w:r>
     </w:p>
     <w:p>
+      <w:pPr>
+        <w:tabs>
+          <w:tab w:pos="8787" w:val="right" w:leader="hyphen"/>
+        </w:tabs>
+      </w:pPr>
       <w:r>
         <w:rPr>
           <w:rFonts w:ascii="Times New Roman" w:hAnsi="Times New Roman"/>
@@ -352,8 +625,26 @@
         </w:rPr>
         <w:t xml:space="preserve">    5.2 Recursos humanos</w:t>
       </w:r>
+      <w:r>
+        <w:rPr>
+          <w:sz w:val="24"/>
+        </w:rPr>
+        <w:tab/>
+      </w:r>
+      <w:r>
+        <w:rPr>
+          <w:rFonts w:ascii="Times New Roman" w:hAnsi="Times New Roman"/>
+          <w:sz w:val="24"/>
+        </w:rPr>
+        <w:t>17</w:t>
+      </w:r>
     </w:p>
     <w:p>
+      <w:pPr>
+        <w:tabs>
+          <w:tab w:pos="8787" w:val="right" w:leader="hyphen"/>
+        </w:tabs>
+      </w:pPr>
       <w:r>
         <w:rPr>
           <w:rFonts w:ascii="Times New Roman" w:hAnsi="Times New Roman"/>
@@ -361,8 +652,26 @@
         </w:rPr>
         <w:t xml:space="preserve">    5.3 Prevención de riesgos laborales</w:t>
       </w:r>
+      <w:r>
+        <w:rPr>
+          <w:sz w:val="24"/>
+        </w:rPr>
+        <w:tab/>
+      </w:r>
+      <w:r>
+        <w:rPr>
+          <w:rFonts w:ascii="Times New Roman" w:hAnsi="Times New Roman"/>
+          <w:sz w:val="24"/>
+        </w:rPr>
+        <w:t>18</w:t>
+      </w:r>
     </w:p>
     <w:p>
+      <w:pPr>
+        <w:tabs>
+          <w:tab w:pos="8787" w:val="right" w:leader="hyphen"/>
+        </w:tabs>
+      </w:pPr>
       <w:r>
         <w:rPr>
           <w:rFonts w:ascii="Times New Roman" w:hAnsi="Times New Roman"/>
@@ -370,8 +679,26 @@
         </w:rPr>
         <w:t xml:space="preserve">    5.4 Análisis medioambiental</w:t>
       </w:r>
+      <w:r>
+        <w:rPr>
+          <w:sz w:val="24"/>
+        </w:rPr>
+        <w:tab/>
+      </w:r>
+      <w:r>
+        <w:rPr>
+          <w:rFonts w:ascii="Times New Roman" w:hAnsi="Times New Roman"/>
+          <w:sz w:val="24"/>
+        </w:rPr>
+        <w:t>19</w:t>
+      </w:r>
     </w:p>
     <w:p>
+      <w:pPr>
+        <w:tabs>
+          <w:tab w:pos="8787" w:val="right" w:leader="hyphen"/>
+        </w:tabs>
+      </w:pPr>
       <w:r>
         <w:rPr>
           <w:rFonts w:ascii="Times New Roman" w:hAnsi="Times New Roman"/>
@@ -379,41 +706,134 @@
         </w:rPr>
         <w:t xml:space="preserve">    5.5 Plan de financiación</w:t>
       </w:r>
-    </w:p>
-    <w:p>
+      <w:r>
+        <w:rPr>
+          <w:sz w:val="24"/>
+        </w:rPr>
+        <w:tab/>
+      </w:r>
       <w:r>
         <w:rPr>
           <w:rFonts w:ascii="Times New Roman" w:hAnsi="Times New Roman"/>
           <w:sz w:val="24"/>
         </w:rPr>
-        <w:t>6. EVALUACIÓN FUNCIONAL</w:t>
+        <w:t>19</w:t>
       </w:r>
     </w:p>
     <w:p>
+      <w:pPr>
+        <w:tabs>
+          <w:tab w:pos="8787" w:val="right" w:leader="hyphen"/>
+        </w:tabs>
+      </w:pPr>
       <w:r>
         <w:rPr>
           <w:rFonts w:ascii="Times New Roman" w:hAnsi="Times New Roman"/>
+          <w:b/>
+          <w:sz w:val="24"/>
+        </w:rPr>
+        <w:t>6. EVALUACIÓN FUNCIONAL</w:t>
+      </w:r>
+      <w:r>
+        <w:rPr>
+          <w:sz w:val="24"/>
+        </w:rPr>
+        <w:tab/>
+      </w:r>
+      <w:r>
+        <w:rPr>
+          <w:rFonts w:ascii="Times New Roman" w:hAnsi="Times New Roman"/>
+          <w:b/>
+          <w:sz w:val="24"/>
+        </w:rPr>
+        <w:t>21</w:t>
+      </w:r>
+    </w:p>
+    <w:p>
+      <w:pPr>
+        <w:tabs>
+          <w:tab w:pos="8787" w:val="right" w:leader="hyphen"/>
+        </w:tabs>
+      </w:pPr>
+      <w:r>
+        <w:rPr>
+          <w:rFonts w:ascii="Times New Roman" w:hAnsi="Times New Roman"/>
+          <w:b/>
           <w:sz w:val="24"/>
         </w:rPr>
         <w:t>7. CONCLUSIÓN</w:t>
       </w:r>
-    </w:p>
-    <w:p>
+      <w:r>
+        <w:rPr>
+          <w:sz w:val="24"/>
+        </w:rPr>
+        <w:tab/>
+      </w:r>
       <w:r>
         <w:rPr>
           <w:rFonts w:ascii="Times New Roman" w:hAnsi="Times New Roman"/>
+          <w:b/>
+          <w:sz w:val="24"/>
+        </w:rPr>
+        <w:t>24</w:t>
+      </w:r>
+    </w:p>
+    <w:p>
+      <w:pPr>
+        <w:tabs>
+          <w:tab w:pos="8787" w:val="right" w:leader="hyphen"/>
+        </w:tabs>
+      </w:pPr>
+      <w:r>
+        <w:rPr>
+          <w:rFonts w:ascii="Times New Roman" w:hAnsi="Times New Roman"/>
+          <w:b/>
           <w:sz w:val="24"/>
         </w:rPr>
         <w:t>8. BIBLIOGRAFÍA</w:t>
       </w:r>
-    </w:p>
-    <w:p>
+      <w:r>
+        <w:rPr>
+          <w:sz w:val="24"/>
+        </w:rPr>
+        <w:tab/>
+      </w:r>
       <w:r>
         <w:rPr>
           <w:rFonts w:ascii="Times New Roman" w:hAnsi="Times New Roman"/>
+          <w:b/>
+          <w:sz w:val="24"/>
+        </w:rPr>
+        <w:t>25</w:t>
+      </w:r>
+    </w:p>
+    <w:p>
+      <w:pPr>
+        <w:tabs>
+          <w:tab w:pos="8787" w:val="right" w:leader="hyphen"/>
+        </w:tabs>
+      </w:pPr>
+      <w:r>
+        <w:rPr>
+          <w:rFonts w:ascii="Times New Roman" w:hAnsi="Times New Roman"/>
+          <w:b/>
           <w:sz w:val="24"/>
         </w:rPr>
         <w:t>9. ANEXOS</w:t>
+      </w:r>
+      <w:r>
+        <w:rPr>
+          <w:sz w:val="24"/>
+        </w:rPr>
+        <w:tab/>
+      </w:r>
+      <w:r>
+        <w:rPr>
+          <w:rFonts w:ascii="Times New Roman" w:hAnsi="Times New Roman"/>
+          <w:b/>
+          <w:sz w:val="24"/>
+        </w:rPr>
+        <w:t>27</w:t>
       </w:r>
     </w:p>
     <w:p>
@@ -423,15 +843,14 @@
     </w:p>
     <w:p>
       <w:pPr>
-        <w:spacing w:before="360" w:after="240"/>
+        <w:spacing w:before="240" w:after="240"/>
         <w:jc w:val="left"/>
       </w:pPr>
       <w:r>
         <w:rPr>
           <w:rFonts w:ascii="Times New Roman" w:hAnsi="Times New Roman"/>
           <w:b/>
-          <w:color w:val="1F3A93"/>
-          <w:sz w:val="28"/>
+          <w:sz w:val="32"/>
         </w:rPr>
         <w:t>1. INTRODUCCIÓN</w:t>
       </w:r>
@@ -535,16 +954,20 @@
       </w:r>
     </w:p>
     <w:p>
-      <w:pPr>
-        <w:spacing w:before="360" w:after="240"/>
+      <w:r>
+        <w:br w:type="page"/>
+      </w:r>
+    </w:p>
+    <w:p>
+      <w:pPr>
+        <w:spacing w:before="240" w:after="240"/>
         <w:jc w:val="left"/>
       </w:pPr>
       <w:r>
         <w:rPr>
           <w:rFonts w:ascii="Times New Roman" w:hAnsi="Times New Roman"/>
           <w:b/>
-          <w:color w:val="1F3A93"/>
-          <w:sz w:val="28"/>
+          <w:sz w:val="32"/>
         </w:rPr>
         <w:t>2. ANÁLISIS</w:t>
       </w:r>
@@ -1142,7 +1565,7 @@
           <w:i w:val="0"/>
           <w:sz w:val="24"/>
         </w:rPr>
-        <w:t>Velocidad de desarrollo. React Native y Next.js comparten lenguaje (JavaScript/TypeScript), lo que permite reutilizar lógica entre web y móvil. Expo simplifica el ciclo de desarrollo y publicación de la aplicación móvil.</w:t>
+        <w:t>Velocidad de desarrollo. React Native y Next.js comparten lenguaje (JavaScript / TypeScript), lo que permite reutilizar lógica entre web y móvil. Expo simplifica el ciclo de desarrollo y publicación de la aplicación móvil.</w:t>
       </w:r>
     </w:p>
     <w:p>
@@ -1614,16 +2037,20 @@
     </w:tbl>
     <w:p/>
     <w:p>
-      <w:pPr>
-        <w:spacing w:before="360" w:after="240"/>
+      <w:r>
+        <w:br w:type="page"/>
+      </w:r>
+    </w:p>
+    <w:p>
+      <w:pPr>
+        <w:spacing w:before="240" w:after="240"/>
         <w:jc w:val="left"/>
       </w:pPr>
       <w:r>
         <w:rPr>
           <w:rFonts w:ascii="Times New Roman" w:hAnsi="Times New Roman"/>
           <w:b/>
-          <w:color w:val="1F3A93"/>
-          <w:sz w:val="28"/>
+          <w:sz w:val="32"/>
         </w:rPr>
         <w:t>3. VALORACIÓN ECONÓMICA</w:t>
       </w:r>
@@ -3173,16 +3600,20 @@
     </w:tbl>
     <w:p/>
     <w:p>
-      <w:pPr>
-        <w:spacing w:before="360" w:after="240"/>
+      <w:r>
+        <w:br w:type="page"/>
+      </w:r>
+    </w:p>
+    <w:p>
+      <w:pPr>
+        <w:spacing w:before="240" w:after="240"/>
         <w:jc w:val="left"/>
       </w:pPr>
       <w:r>
         <w:rPr>
           <w:rFonts w:ascii="Times New Roman" w:hAnsi="Times New Roman"/>
           <w:b/>
-          <w:color w:val="1F3A93"/>
-          <w:sz w:val="28"/>
+          <w:sz w:val="32"/>
         </w:rPr>
         <w:t>4. VIABILIDAD DEL PROYECTO</w:t>
       </w:r>
@@ -4059,7 +4490,7 @@
                 <w:rFonts w:ascii="Times New Roman" w:hAnsi="Times New Roman"/>
                 <w:sz w:val="22"/>
               </w:rPr>
-              <w:t>Tests automáticos, auditoría externa</w:t>
+              <w:t>Tests automáticos, auditoría</w:t>
             </w:r>
           </w:p>
         </w:tc>
@@ -4121,7 +4552,7 @@
                 <w:rFonts w:ascii="Times New Roman" w:hAnsi="Times New Roman"/>
                 <w:sz w:val="22"/>
               </w:rPr>
-              <w:t>Backups diarios, plan de migración</w:t>
+              <w:t>Backups diarios, plan migración</w:t>
             </w:r>
           </w:p>
         </w:tc>
@@ -4377,16 +4808,20 @@
     </w:tbl>
     <w:p/>
     <w:p>
-      <w:pPr>
-        <w:spacing w:before="360" w:after="240"/>
+      <w:r>
+        <w:br w:type="page"/>
+      </w:r>
+    </w:p>
+    <w:p>
+      <w:pPr>
+        <w:spacing w:before="240" w:after="240"/>
         <w:jc w:val="left"/>
       </w:pPr>
       <w:r>
         <w:rPr>
           <w:rFonts w:ascii="Times New Roman" w:hAnsi="Times New Roman"/>
           <w:b/>
-          <w:color w:val="1F3A93"/>
-          <w:sz w:val="28"/>
+          <w:sz w:val="32"/>
         </w:rPr>
         <w:t>5. PUESTA EN MARCHA</w:t>
       </w:r>
@@ -5292,16 +5727,20 @@
       </w:r>
     </w:p>
     <w:p>
-      <w:pPr>
-        <w:spacing w:before="360" w:after="240"/>
+      <w:r>
+        <w:br w:type="page"/>
+      </w:r>
+    </w:p>
+    <w:p>
+      <w:pPr>
+        <w:spacing w:before="240" w:after="240"/>
         <w:jc w:val="left"/>
       </w:pPr>
       <w:r>
         <w:rPr>
           <w:rFonts w:ascii="Times New Roman" w:hAnsi="Times New Roman"/>
           <w:b/>
-          <w:color w:val="1F3A93"/>
-          <w:sz w:val="28"/>
+          <w:sz w:val="32"/>
         </w:rPr>
         <w:t>6. EVALUACIÓN FUNCIONAL</w:t>
       </w:r>
@@ -5739,7 +6178,7 @@
                 <w:rFonts w:ascii="Times New Roman" w:hAnsi="Times New Roman"/>
                 <w:sz w:val="22"/>
               </w:rPr>
-              <w:t>✓ Gemma 3 12B funcionando en producción</w:t>
+              <w:t>✓ Gemma 3 12B funcionando</w:t>
             </w:r>
           </w:p>
         </w:tc>
@@ -5857,16 +6296,20 @@
       </w:r>
     </w:p>
     <w:p>
-      <w:pPr>
-        <w:spacing w:before="360" w:after="240"/>
+      <w:r>
+        <w:br w:type="page"/>
+      </w:r>
+    </w:p>
+    <w:p>
+      <w:pPr>
+        <w:spacing w:before="240" w:after="240"/>
         <w:jc w:val="left"/>
       </w:pPr>
       <w:r>
         <w:rPr>
           <w:rFonts w:ascii="Times New Roman" w:hAnsi="Times New Roman"/>
           <w:b/>
-          <w:color w:val="1F3A93"/>
-          <w:sz w:val="28"/>
+          <w:sz w:val="32"/>
         </w:rPr>
         <w:t>7. CONCLUSIÓN</w:t>
       </w:r>
@@ -5956,16 +6399,20 @@
       </w:r>
     </w:p>
     <w:p>
-      <w:pPr>
-        <w:spacing w:before="360" w:after="240"/>
+      <w:r>
+        <w:br w:type="page"/>
+      </w:r>
+    </w:p>
+    <w:p>
+      <w:pPr>
+        <w:spacing w:before="240" w:after="240"/>
         <w:jc w:val="left"/>
       </w:pPr>
       <w:r>
         <w:rPr>
           <w:rFonts w:ascii="Times New Roman" w:hAnsi="Times New Roman"/>
           <w:b/>
-          <w:color w:val="1F3A93"/>
-          <w:sz w:val="28"/>
+          <w:sz w:val="32"/>
         </w:rPr>
         <w:t>8. BIBLIOGRAFÍA</w:t>
       </w:r>
@@ -5974,6 +6421,7 @@
       <w:pPr>
         <w:spacing w:after="120"/>
         <w:ind w:left="709" w:hanging="709"/>
+        <w:jc w:val="both"/>
       </w:pPr>
       <w:r>
         <w:rPr>
@@ -5987,6 +6435,7 @@
       <w:pPr>
         <w:spacing w:after="120"/>
         <w:ind w:left="709" w:hanging="709"/>
+        <w:jc w:val="both"/>
       </w:pPr>
       <w:r>
         <w:rPr>
@@ -6000,6 +6449,7 @@
       <w:pPr>
         <w:spacing w:after="120"/>
         <w:ind w:left="709" w:hanging="709"/>
+        <w:jc w:val="both"/>
       </w:pPr>
       <w:r>
         <w:rPr>
@@ -6013,6 +6463,7 @@
       <w:pPr>
         <w:spacing w:after="120"/>
         <w:ind w:left="709" w:hanging="709"/>
+        <w:jc w:val="both"/>
       </w:pPr>
       <w:r>
         <w:rPr>
@@ -6026,6 +6477,7 @@
       <w:pPr>
         <w:spacing w:after="120"/>
         <w:ind w:left="709" w:hanging="709"/>
+        <w:jc w:val="both"/>
       </w:pPr>
       <w:r>
         <w:rPr>
@@ -6039,6 +6491,7 @@
       <w:pPr>
         <w:spacing w:after="120"/>
         <w:ind w:left="709" w:hanging="709"/>
+        <w:jc w:val="both"/>
       </w:pPr>
       <w:r>
         <w:rPr>
@@ -6052,6 +6505,7 @@
       <w:pPr>
         <w:spacing w:after="120"/>
         <w:ind w:left="709" w:hanging="709"/>
+        <w:jc w:val="both"/>
       </w:pPr>
       <w:r>
         <w:rPr>
@@ -6065,6 +6519,7 @@
       <w:pPr>
         <w:spacing w:after="120"/>
         <w:ind w:left="709" w:hanging="709"/>
+        <w:jc w:val="both"/>
       </w:pPr>
       <w:r>
         <w:rPr>
@@ -6078,6 +6533,7 @@
       <w:pPr>
         <w:spacing w:after="120"/>
         <w:ind w:left="709" w:hanging="709"/>
+        <w:jc w:val="both"/>
       </w:pPr>
       <w:r>
         <w:rPr>
@@ -6091,6 +6547,7 @@
       <w:pPr>
         <w:spacing w:after="120"/>
         <w:ind w:left="709" w:hanging="709"/>
+        <w:jc w:val="both"/>
       </w:pPr>
       <w:r>
         <w:rPr>
@@ -6104,6 +6561,7 @@
       <w:pPr>
         <w:spacing w:after="120"/>
         <w:ind w:left="709" w:hanging="709"/>
+        <w:jc w:val="both"/>
       </w:pPr>
       <w:r>
         <w:rPr>
@@ -6117,6 +6575,7 @@
       <w:pPr>
         <w:spacing w:after="120"/>
         <w:ind w:left="709" w:hanging="709"/>
+        <w:jc w:val="both"/>
       </w:pPr>
       <w:r>
         <w:rPr>
@@ -6130,6 +6589,7 @@
       <w:pPr>
         <w:spacing w:after="120"/>
         <w:ind w:left="709" w:hanging="709"/>
+        <w:jc w:val="both"/>
       </w:pPr>
       <w:r>
         <w:rPr>
@@ -6143,6 +6603,7 @@
       <w:pPr>
         <w:spacing w:after="120"/>
         <w:ind w:left="709" w:hanging="709"/>
+        <w:jc w:val="both"/>
       </w:pPr>
       <w:r>
         <w:rPr>
@@ -6153,16 +6614,20 @@
       </w:r>
     </w:p>
     <w:p>
-      <w:pPr>
-        <w:spacing w:before="360" w:after="240"/>
+      <w:r>
+        <w:br w:type="page"/>
+      </w:r>
+    </w:p>
+    <w:p>
+      <w:pPr>
+        <w:spacing w:before="240" w:after="240"/>
         <w:jc w:val="left"/>
       </w:pPr>
       <w:r>
         <w:rPr>
           <w:rFonts w:ascii="Times New Roman" w:hAnsi="Times New Roman"/>
           <w:b/>
-          <w:color w:val="1F3A93"/>
-          <w:sz w:val="28"/>
+          <w:sz w:val="32"/>
         </w:rPr>
         <w:t>9. ANEXOS</w:t>
       </w:r>
@@ -6191,7 +6656,7 @@
           <w:i/>
           <w:sz w:val="24"/>
         </w:rPr>
-        <w:t>[Insertar aquí capturas de las pantallas principales: login, lista de incidencias, detalle de incidencia, base de conocimiento, foro, asistente IA, panel SuperAdmin]</w:t>
+        <w:t>[INSERTAR AQUÍ las capturas de las pantallas principales: login, lista de incidencias, detalle de incidencia, base de conocimiento, foro, asistente IA, panel SuperAdmin]</w:t>
       </w:r>
     </w:p>
     <w:p>
@@ -6218,7 +6683,7 @@
           <w:i/>
           <w:sz w:val="24"/>
         </w:rPr>
-        <w:t>[Insertar aquí diagrama mostrando: app móvil → API REST (Railway) → PostgreSQL, con conexiones externas a Resend (email) y Google Gemini (IA)]</w:t>
+        <w:t>[INSERTAR AQUÍ el diagrama mostrando: app móvil → API REST (Railway) → PostgreSQL, con conexiones externas a Resend (email) y Google Gemini (IA)]</w:t>
       </w:r>
     </w:p>
     <w:p>
@@ -6245,7 +6710,7 @@
           <w:i/>
           <w:sz w:val="24"/>
         </w:rPr>
-        <w:t>[Insertar aquí diagrama ER con tablas: companies, users, incidents, comments, incident_history, notifications, knowledge_base, knowledge_ratings, forum_posts, forum_comments, forum_reactions, password_resets, ai_conversations]</w:t>
+        <w:t>[INSERTAR AQUÍ el diagrama ER con las tablas: companies, users, incidents, comments, incident_history, notifications, knowledge_base, knowledge_ratings, forum_posts, forum_comments, forum_reactions, password_resets, ai_conversations]</w:t>
       </w:r>
     </w:p>
     <w:p>
@@ -6546,13 +7011,154 @@
     </w:tbl>
     <w:p/>
     <w:sectPr>
+      <w:headerReference w:type="default" r:id="rId9"/>
+      <w:footerReference w:type="default" r:id="rId10"/>
       <w:pgSz w:w="12240" w:h="15840"/>
-      <w:pgMar w:top="1134" w:right="1417" w:bottom="1134" w:left="1417" w:header="720" w:footer="720" w:gutter="0"/>
+      <w:pgMar w:top="1134" w:right="1417" w:bottom="1134" w:left="1417" w:header="454" w:footer="454" w:gutter="0"/>
       <w:cols w:space="720"/>
       <w:docGrid w:linePitch="360"/>
     </w:sectPr>
   </w:body>
 </w:document>
+</file>
+
+<file path=word/footer1.xml><?xml version="1.0" encoding="utf-8"?>
+<w:ftr xmlns:m="http://schemas.openxmlformats.org/officeDocument/2006/math" xmlns:mc="http://schemas.openxmlformats.org/markup-compatibility/2006" xmlns:mo="http://schemas.microsoft.com/office/mac/office/2008/main" xmlns:mv="urn:schemas-microsoft-com:mac:vml" xmlns:o="urn:schemas-microsoft-com:office:office" xmlns:r="http://schemas.openxmlformats.org/officeDocument/2006/relationships" xmlns:v="urn:schemas-microsoft-com:vml" xmlns:w10="urn:schemas-microsoft-com:office:word" xmlns:w14="http://schemas.microsoft.com/office/word/2010/wordml" xmlns:w="http://schemas.openxmlformats.org/wordprocessingml/2006/main" xmlns:wne="http://schemas.microsoft.com/office/word/2006/wordml" xmlns:wp14="http://schemas.microsoft.com/office/word/2010/wordprocessingDrawing" xmlns:wp="http://schemas.openxmlformats.org/drawingml/2006/wordprocessingDrawing" xmlns:wpc="http://schemas.microsoft.com/office/word/2010/wordprocessingCanvas" xmlns:wpg="http://schemas.microsoft.com/office/word/2010/wordprocessingGroup" xmlns:wpi="http://schemas.microsoft.com/office/word/2010/wordprocessingInk" xmlns:wps="http://schemas.microsoft.com/office/word/2010/wordprocessingShape" mc:Ignorable="w14 wp14">
+  <w:p>
+    <w:pPr>
+      <w:pStyle w:val="Footer"/>
+      <w:jc w:val="right"/>
+    </w:pPr>
+    <w:r>
+      <w:rPr>
+        <w:rFonts w:ascii="Times New Roman" w:hAnsi="Times New Roman"/>
+        <w:sz w:val="20"/>
+      </w:rPr>
+      <w:fldChar w:fldCharType="begin"/>
+      <w:instrText>PAGE</w:instrText>
+      <w:fldChar w:fldCharType="end"/>
+    </w:r>
+  </w:p>
+</w:ftr>
+</file>
+
+<file path=word/header1.xml><?xml version="1.0" encoding="utf-8"?>
+<w:hdr xmlns:m="http://schemas.openxmlformats.org/officeDocument/2006/math" xmlns:mc="http://schemas.openxmlformats.org/markup-compatibility/2006" xmlns:mo="http://schemas.microsoft.com/office/mac/office/2008/main" xmlns:mv="urn:schemas-microsoft-com:mac:vml" xmlns:o="urn:schemas-microsoft-com:office:office" xmlns:r="http://schemas.openxmlformats.org/officeDocument/2006/relationships" xmlns:v="urn:schemas-microsoft-com:vml" xmlns:w10="urn:schemas-microsoft-com:office:word" xmlns:w14="http://schemas.microsoft.com/office/word/2010/wordml" xmlns:w="http://schemas.openxmlformats.org/wordprocessingml/2006/main" xmlns:wne="http://schemas.microsoft.com/office/word/2006/wordml" xmlns:wp14="http://schemas.microsoft.com/office/word/2010/wordprocessingDrawing" xmlns:wp="http://schemas.openxmlformats.org/drawingml/2006/wordprocessingDrawing" xmlns:wpc="http://schemas.microsoft.com/office/word/2010/wordprocessingCanvas" xmlns:wpg="http://schemas.microsoft.com/office/word/2010/wordprocessingGroup" xmlns:wpi="http://schemas.microsoft.com/office/word/2010/wordprocessingInk" xmlns:wps="http://schemas.microsoft.com/office/word/2010/wordprocessingShape" mc:Ignorable="w14 wp14">
+  <w:p>
+    <w:pPr>
+      <w:pStyle w:val="Header"/>
+    </w:pPr>
+  </w:p>
+  <w:tbl>
+    <w:tblPr>
+      <w:tblW w:type="auto" w:w="0"/>
+      <w:tblLayout w:type="fixed"/>
+      <w:tblLook w:firstColumn="1" w:firstRow="1" w:lastColumn="0" w:lastRow="0" w:noHBand="0" w:noVBand="1" w:val="04A0"/>
+      <w:tblBorders>
+        <w:top w:val="nil"/>
+        <w:left w:val="nil"/>
+        <w:bottom w:val="nil"/>
+        <w:right w:val="nil"/>
+        <w:insideH w:val="nil"/>
+        <w:insideV w:val="nil"/>
+      </w:tblBorders>
+    </w:tblPr>
+    <w:tblGrid>
+      <w:gridCol w:w="4535"/>
+      <w:gridCol w:w="4535"/>
+    </w:tblGrid>
+    <w:tr>
+      <w:tc>
+        <w:tcPr>
+          <w:tcW w:type="dxa" w:w="4535"/>
+        </w:tcPr>
+        <w:p>
+          <w:pPr>
+            <w:jc w:val="left"/>
+          </w:pPr>
+          <w:r>
+            <w:drawing>
+              <wp:inline xmlns:a="http://schemas.openxmlformats.org/drawingml/2006/main" xmlns:pic="http://schemas.openxmlformats.org/drawingml/2006/picture">
+                <wp:extent cx="720000" cy="720000"/>
+                <wp:docPr id="1" name="Picture 1"/>
+                <wp:cNvGraphicFramePr>
+                  <a:graphicFrameLocks noChangeAspect="1"/>
+                </wp:cNvGraphicFramePr>
+                <a:graphic>
+                  <a:graphicData uri="http://schemas.openxmlformats.org/drawingml/2006/picture">
+                    <pic:pic>
+                      <pic:nvPicPr>
+                        <pic:cNvPr id="0" name="logo_corner.png"/>
+                        <pic:cNvPicPr/>
+                      </pic:nvPicPr>
+                      <pic:blipFill>
+                        <a:blip r:embed="rId1"/>
+                        <a:stretch>
+                          <a:fillRect/>
+                        </a:stretch>
+                      </pic:blipFill>
+                      <pic:spPr>
+                        <a:xfrm>
+                          <a:off x="0" y="0"/>
+                          <a:ext cx="720000" cy="720000"/>
+                        </a:xfrm>
+                        <a:prstGeom prst="rect"/>
+                      </pic:spPr>
+                    </pic:pic>
+                  </a:graphicData>
+                </a:graphic>
+              </wp:inline>
+            </w:drawing>
+          </w:r>
+        </w:p>
+      </w:tc>
+      <w:tc>
+        <w:tcPr>
+          <w:tcW w:type="dxa" w:w="4535"/>
+        </w:tcPr>
+        <w:p>
+          <w:pPr>
+            <w:jc w:val="right"/>
+          </w:pPr>
+          <w:r>
+            <w:drawing>
+              <wp:inline xmlns:a="http://schemas.openxmlformats.org/drawingml/2006/main" xmlns:pic="http://schemas.openxmlformats.org/drawingml/2006/picture">
+                <wp:extent cx="1260000" cy="630000"/>
+                <wp:docPr id="2" name="Picture 2"/>
+                <wp:cNvGraphicFramePr>
+                  <a:graphicFrameLocks noChangeAspect="1"/>
+                </wp:cNvGraphicFramePr>
+                <a:graphic>
+                  <a:graphicData uri="http://schemas.openxmlformats.org/drawingml/2006/picture">
+                    <pic:pic>
+                      <pic:nvPicPr>
+                        <pic:cNvPr id="0" name="logo_header.png"/>
+                        <pic:cNvPicPr/>
+                      </pic:nvPicPr>
+                      <pic:blipFill>
+                        <a:blip r:embed="rId2"/>
+                        <a:stretch>
+                          <a:fillRect/>
+                        </a:stretch>
+                      </pic:blipFill>
+                      <pic:spPr>
+                        <a:xfrm>
+                          <a:off x="0" y="0"/>
+                          <a:ext cx="1260000" cy="630000"/>
+                        </a:xfrm>
+                        <a:prstGeom prst="rect"/>
+                      </pic:spPr>
+                    </pic:pic>
+                  </a:graphicData>
+                </a:graphic>
+              </wp:inline>
+            </w:drawing>
+          </w:r>
+        </w:p>
+      </w:tc>
+    </w:tr>
+  </w:tbl>
+</w:hdr>
 </file>
 
 <file path=word/numbering.xml><?xml version="1.0" encoding="utf-8"?>

</xml_diff>